<commit_message>
adjusted script for more flexible bookmarking
</commit_message>
<xml_diff>
--- a/report_template.docx
+++ b/report_template.docx
@@ -15,7 +15,17 @@
         <w:pStyle w:val="Subtitle"/>
       </w:pPr>
       <w:r>
-        <w:t xml:space="preserve">Project: ****</w:t>
+        <w:t xml:space="preserve">Project:</w:t>
+      </w:r>
+      <w:r>
+        <w:t xml:space="preserve"> </w:t>
+      </w:r>
+      <w:r>
+        <w:rPr>
+          <w:b/>
+          <w:bCs/>
+        </w:rPr>
+        <w:t xml:space="preserve">AmazeLight</w:t>
       </w:r>
     </w:p>
     <w:p>
@@ -23,7 +33,7 @@
         <w:pStyle w:val="Date"/>
       </w:pPr>
       <w:r>
-        <w:t xml:space="preserve">2025-07-22</w:t>
+        <w:t xml:space="preserve">2025-07-24</w:t>
       </w:r>
     </w:p>
     <w:bookmarkStart w:id="22" w:name="preface"/>
@@ -81,7 +91,7 @@
       </w:r>
     </w:p>
     <w:bookmarkEnd w:id="22"/>
-    <w:bookmarkStart w:id="24" w:name="general-information"/>
+    <w:bookmarkStart w:id="25" w:name="general-information"/>
     <w:p>
       <w:pPr>
         <w:pStyle w:val="berschrift2"/>
@@ -95,10 +105,36 @@
         <w:pStyle w:val="FirstParagraph"/>
       </w:pPr>
       <w:r>
-        <w:t xml:space="preserve">Type(s) of study: Not specified</w:t>
+        <w:t xml:space="preserve">Type(s) of study: Observational, Cross-sectional</w:t>
       </w:r>
     </w:p>
-    <w:bookmarkStart w:id="23" w:name="description-of-the-main-use-case"/>
+    <w:bookmarkStart w:id="23" w:name="this-project-requires-50-devices"/>
+    <w:p>
+      <w:pPr>
+        <w:pStyle w:val="berschrift3"/>
+      </w:pPr>
+      <w:r>
+        <w:t xml:space="preserve">This project requires</w:t>
+      </w:r>
+      <w:r>
+        <w:t xml:space="preserve"> </w:t>
+      </w:r>
+      <w:r>
+        <w:rPr>
+          <w:b/>
+          <w:bCs/>
+        </w:rPr>
+        <w:t xml:space="preserve">50</w:t>
+      </w:r>
+      <w:r>
+        <w:t xml:space="preserve"> </w:t>
+      </w:r>
+      <w:r>
+        <w:t xml:space="preserve">devices</w:t>
+      </w:r>
+    </w:p>
+    <w:bookmarkEnd w:id="23"/>
+    <w:bookmarkStart w:id="24" w:name="description-of-the-main-use-case"/>
     <w:p>
       <w:pPr>
         <w:pStyle w:val="berschrift3"/>
@@ -107,9 +143,17 @@
         <w:t xml:space="preserve">Description of the (main) use case:</w:t>
       </w:r>
     </w:p>
-    <w:bookmarkEnd w:id="23"/>
+    <w:p>
+      <w:pPr>
+        <w:pStyle w:val="FirstParagraph"/>
+      </w:pPr>
+      <w:r>
+        <w:t xml:space="preserve">Participants are fitted with a device at the study visit and instructed to wear it continuously for 14 days, removing it only for intense water‑based activities. Data are wirelessly uploaded to a secure cloud server once a day. Participants complete one online questionnaire for chronotype. Primary outcomes are 24‑h melanopic dose, timing of first &gt;250 lux epoch, and their correlation with midpoint of sleep on free days (MSFsc).</w:t>
+      </w:r>
+    </w:p>
     <w:bookmarkEnd w:id="24"/>
-    <w:bookmarkStart w:id="25" w:name="hardware-requirements"/>
+    <w:bookmarkEnd w:id="25"/>
+    <w:bookmarkStart w:id="26" w:name="hardware-requirements"/>
     <w:p>
       <w:pPr>
         <w:pStyle w:val="berschrift2"/>
@@ -126,9 +170,9 @@
         <w:tblLook w:firstRow="1" w:lastRow="0" w:firstColumn="0" w:lastColumn="0" w:noHBand="0" w:noVBand="0" w:val="0020"/>
       </w:tblPr>
       <w:tblGrid>
-        <w:gridCol w:w="2982"/>
-        <w:gridCol w:w="2468"/>
-        <w:gridCol w:w="2468"/>
+        <w:gridCol w:w="2929"/>
+        <w:gridCol w:w="2495"/>
+        <w:gridCol w:w="2495"/>
       </w:tblGrid>
       <w:tr>
         <w:trPr>
@@ -187,7 +231,7 @@
               <w:pStyle w:val="Compact"/>
             </w:pPr>
             <w:r>
-              <w:t xml:space="preserve">Not specified</w:t>
+              <w:t xml:space="preserve">Necklace</w:t>
             </w:r>
           </w:p>
         </w:tc>
@@ -219,7 +263,7 @@
               <w:pStyle w:val="Compact"/>
             </w:pPr>
             <w:r>
-              <w:t xml:space="preserve">5 x 5 x 2 cm</w:t>
+              <w:t xml:space="preserve">3 x 5 x 1.5 cm</w:t>
             </w:r>
           </w:p>
         </w:tc>
@@ -265,8 +309,8 @@
         </w:tc>
       </w:tr>
     </w:tbl>
-    <w:bookmarkEnd w:id="25"/>
-    <w:bookmarkStart w:id="26" w:name="data-requirements"/>
+    <w:bookmarkEnd w:id="26"/>
+    <w:bookmarkStart w:id="27" w:name="data-requirements"/>
     <w:p>
       <w:pPr>
         <w:pStyle w:val="berschrift2"/>
@@ -283,9 +327,9 @@
         <w:tblLook w:firstRow="1" w:lastRow="0" w:firstColumn="0" w:lastColumn="0" w:noHBand="0" w:noVBand="0" w:val="0020"/>
       </w:tblPr>
       <w:tblGrid>
-        <w:gridCol w:w="2917"/>
-        <w:gridCol w:w="2501"/>
-        <w:gridCol w:w="2501"/>
+        <w:gridCol w:w="2860"/>
+        <w:gridCol w:w="2530"/>
+        <w:gridCol w:w="2530"/>
       </w:tblGrid>
       <w:tr>
         <w:trPr>
@@ -344,7 +388,7 @@
               <w:pStyle w:val="Compact"/>
             </w:pPr>
             <w:r>
-              <w:t xml:space="preserve">≤ 30 seconds</w:t>
+              <w:t xml:space="preserve">≤ 60 seconds</w:t>
             </w:r>
           </w:p>
         </w:tc>
@@ -376,7 +420,7 @@
               <w:pStyle w:val="Compact"/>
             </w:pPr>
             <w:r>
-              <w:t xml:space="preserve">Not specified</w:t>
+              <w:t xml:space="preserve">Recording interval needs to be freely adjustable</w:t>
             </w:r>
           </w:p>
         </w:tc>
@@ -390,8 +434,8 @@
         </w:tc>
       </w:tr>
     </w:tbl>
-    <w:bookmarkEnd w:id="26"/>
-    <w:bookmarkStart w:id="27" w:name="other-requirements"/>
+    <w:bookmarkEnd w:id="27"/>
+    <w:bookmarkStart w:id="28" w:name="other-requirements"/>
     <w:p>
       <w:pPr>
         <w:pStyle w:val="berschrift2"/>
@@ -408,9 +452,9 @@
         <w:tblLook w:firstRow="1" w:lastRow="0" w:firstColumn="0" w:lastColumn="0" w:noHBand="0" w:noVBand="0" w:val="0020"/>
       </w:tblPr>
       <w:tblGrid>
-        <w:gridCol w:w="2917"/>
-        <w:gridCol w:w="2501"/>
-        <w:gridCol w:w="2501"/>
+        <w:gridCol w:w="2860"/>
+        <w:gridCol w:w="2530"/>
+        <w:gridCol w:w="2530"/>
       </w:tblGrid>
       <w:tr>
         <w:trPr>
@@ -469,7 +513,7 @@
               <w:pStyle w:val="Compact"/>
             </w:pPr>
             <w:r>
-              <w:t xml:space="preserve">Not specified</w:t>
+              <w:t xml:space="preserve">500 €</w:t>
             </w:r>
           </w:p>
         </w:tc>
@@ -483,7 +527,7 @@
         </w:tc>
       </w:tr>
     </w:tbl>
-    <w:bookmarkEnd w:id="27"/>
+    <w:bookmarkEnd w:id="28"/>
     <w:sectPr>
       <w:headerReference r:id="rId9" w:type="default"/>
       <w:pgSz w:h="15840" w:w="12240"/>

</xml_diff>

<commit_message>
update to app navigation
</commit_message>
<xml_diff>
--- a/report_template.docx
+++ b/report_template.docx
@@ -4,7 +4,7 @@
   <w:body>
     <w:p>
       <w:pPr>
-        <w:pStyle w:val="Title"/>
+        <w:pStyle w:val="Titel"/>
       </w:pPr>
       <w:r>
         <w:t xml:space="preserve">Wearable device requirements</w:t>
@@ -12,7 +12,7 @@
     </w:p>
     <w:p>
       <w:pPr>
-        <w:pStyle w:val="Subtitle"/>
+        <w:pStyle w:val="Untertitel"/>
       </w:pPr>
       <w:r>
         <w:t xml:space="preserve">Project: ****</w:t>
@@ -20,10 +20,10 @@
     </w:p>
     <w:p>
       <w:pPr>
-        <w:pStyle w:val="Date"/>
-      </w:pPr>
-      <w:r>
-        <w:t xml:space="preserve">2025-10-31</w:t>
+        <w:pStyle w:val="Datum"/>
+      </w:pPr>
+      <w:r>
+        <w:t xml:space="preserve">2026-03-30</w:t>
       </w:r>
     </w:p>
     <w:bookmarkStart w:id="23" w:name="preface"/>

</xml_diff>